<commit_message>
docs(academic): fix endorsement letters and add director endorsement letter
</commit_message>
<xml_diff>
--- a/CartasVoBo/carta_solicitud_aval_proyecto_grado-JuanDiego.docx
+++ b/CartasVoBo/carta_solicitud_aval_proyecto_grado-JuanDiego.docx
@@ -12,7 +12,7 @@
           <w:sz w:val="24"/>
           <w:szCs w:val="24"/>
         </w:rPr>
-        <w:t xml:space="preserve">Neiva, Huila, [Día] de [Mes] de [Año]</w:t>
+        <w:t xml:space="preserve">Neiva, Huila, ____ de ______________ de 2026</w:t>
       </w:r>
     </w:p>
     <w:p xmlns:wp14="http://schemas.microsoft.com/office/word/2010/wordml" wp14:textId="77777777">
@@ -59,15 +59,7 @@
           <w:szCs w:val="24"/>
           <w:lang w:val="es-ES"/>
         </w:rPr>
-        <w:t>Corporacion</w:t>
-      </w:r>
-      <w:r>
-        <w:rPr>
-          <w:sz w:val="24"/>
-          <w:szCs w:val="24"/>
-          <w:lang w:val="es-ES"/>
-        </w:rPr>
-        <w:t xml:space="preserve"> Universitaria Del Huila - CORHUILA</w:t>
+        <w:t xml:space="preserve">Corporación Universitaria del Huila – CORHUILA</w:t>
       </w:r>
     </w:p>
     <w:p>
@@ -134,99 +126,7 @@
           <w:szCs w:val="24"/>
           <w:lang w:val="es-ES"/>
         </w:rPr>
-        <w:t xml:space="preserve">Por medio de la presente, yo, </w:t>
-      </w:r>
-      <w:r>
-        <w:rPr>
-          <w:b w:val="1"/>
-          <w:bCs w:val="1"/>
-          <w:sz w:val="24"/>
-          <w:szCs w:val="24"/>
-          <w:lang w:val="es-ES"/>
-        </w:rPr>
-        <w:t>Juan Diego Tovar Rodriguez</w:t>
-      </w:r>
-      <w:r>
-        <w:rPr>
-          <w:sz w:val="24"/>
-          <w:szCs w:val="24"/>
-          <w:lang w:val="es-ES"/>
-        </w:rPr>
-        <w:t>, identificado(a) con cédula de ciudadanía No.</w:t>
-      </w:r>
-      <w:r>
-        <w:rPr>
-          <w:sz w:val="24"/>
-          <w:szCs w:val="24"/>
-          <w:lang w:val="es-ES"/>
-        </w:rPr>
-        <w:t xml:space="preserve"> </w:t>
-      </w:r>
-      <w:r>
-        <w:rPr>
-          <w:b w:val="1"/>
-          <w:bCs w:val="1"/>
-          <w:sz w:val="24"/>
-          <w:szCs w:val="24"/>
-          <w:lang w:val="es-ES"/>
-        </w:rPr>
-        <w:t>1.077.224.070</w:t>
-      </w:r>
-      <w:r>
-        <w:rPr>
-          <w:sz w:val="24"/>
-          <w:szCs w:val="24"/>
-          <w:lang w:val="es-ES"/>
-        </w:rPr>
-        <w:t xml:space="preserve"> de </w:t>
-      </w:r>
-      <w:r>
-        <w:rPr>
-          <w:sz w:val="24"/>
-          <w:szCs w:val="24"/>
-          <w:lang w:val="es-ES"/>
-        </w:rPr>
-        <w:t>Neiva</w:t>
-      </w:r>
-      <w:r>
-        <w:rPr>
-          <w:sz w:val="24"/>
-          <w:szCs w:val="24"/>
-          <w:lang w:val="es-ES"/>
-        </w:rPr>
-        <w:t xml:space="preserve">, estudiante del programa de </w:t>
-      </w:r>
-      <w:r>
-        <w:rPr>
-          <w:sz w:val="24"/>
-          <w:szCs w:val="24"/>
-          <w:lang w:val="es-ES"/>
-        </w:rPr>
-        <w:t>Ingeniera de sistemas</w:t>
-      </w:r>
-      <w:r>
-        <w:rPr>
-          <w:sz w:val="24"/>
-          <w:szCs w:val="24"/>
-          <w:lang w:val="es-ES"/>
-        </w:rPr>
-        <w:t xml:space="preserve">, con código estudiantil </w:t>
-      </w:r>
-      <w:r>
-        <w:rPr>
-          <w:sz w:val="24"/>
-          <w:szCs w:val="24"/>
-          <w:lang w:val="es-ES"/>
-        </w:rPr>
-        <w:t>9021122856</w:t>
-      </w:r>
-      <w:r>
-        <w:rPr>
-          <w:sz w:val="24"/>
-          <w:szCs w:val="24"/>
-          <w:lang w:val="es-ES"/>
-        </w:rPr>
-        <w:t>, me permito solicitar de manera respetuosa el aval y visto bueno de esta Facultad para adelantar mi proceso de grado bajo la modalidad de Proyecto, de acuerdo con lo establecido en el reglamento estudiantil vigente.</w:t>
+        <w:t xml:space="preserve">Por medio de la presente, yo, Juan Diego Tovar Rodriguez, identificado(a) con cédula de ciudadanía No. 1.077.224.070 de Neiva, estudiante del programa de Ingeniería de Sistemas, con código estudiantil 9021122856, me permito solicitar de manera respetuosa el aval y visto bueno de esta Facultad para adelantar mi proceso de grado bajo la modalidad de Proyecto, de acuerdo con lo establecido en el reglamento estudiantil vigente.</w:t>
       </w:r>
     </w:p>
     <w:p xmlns:wp14="http://schemas.microsoft.com/office/word/2010/wordml" wp14:textId="0865D377">
@@ -240,303 +140,7 @@
           <w:szCs w:val="24"/>
           <w:lang w:val="en-US"/>
         </w:rPr>
-        <w:t xml:space="preserve">La </w:t>
-      </w:r>
-      <w:r>
-        <w:rPr>
-          <w:sz w:val="24"/>
-          <w:szCs w:val="24"/>
-          <w:lang w:val="en-US"/>
-        </w:rPr>
-        <w:t>modalidad</w:t>
-      </w:r>
-      <w:r>
-        <w:rPr>
-          <w:sz w:val="24"/>
-          <w:szCs w:val="24"/>
-          <w:lang w:val="en-US"/>
-        </w:rPr>
-        <w:t xml:space="preserve"> </w:t>
-      </w:r>
-      <w:r>
-        <w:rPr>
-          <w:sz w:val="24"/>
-          <w:szCs w:val="24"/>
-          <w:lang w:val="en-US"/>
-        </w:rPr>
-        <w:t>escogida</w:t>
-      </w:r>
-      <w:r>
-        <w:rPr>
-          <w:sz w:val="24"/>
-          <w:szCs w:val="24"/>
-          <w:lang w:val="en-US"/>
-        </w:rPr>
-        <w:t xml:space="preserve"> para </w:t>
-      </w:r>
-      <w:r>
-        <w:rPr>
-          <w:sz w:val="24"/>
-          <w:szCs w:val="24"/>
-          <w:lang w:val="en-US"/>
-        </w:rPr>
-        <w:t>optar</w:t>
-      </w:r>
-      <w:r>
-        <w:rPr>
-          <w:sz w:val="24"/>
-          <w:szCs w:val="24"/>
-          <w:lang w:val="en-US"/>
-        </w:rPr>
-        <w:t xml:space="preserve"> al </w:t>
-      </w:r>
-      <w:r>
-        <w:rPr>
-          <w:sz w:val="24"/>
-          <w:szCs w:val="24"/>
-          <w:lang w:val="en-US"/>
-        </w:rPr>
-        <w:t>título</w:t>
-      </w:r>
-      <w:r>
-        <w:rPr>
-          <w:sz w:val="24"/>
-          <w:szCs w:val="24"/>
-          <w:lang w:val="en-US"/>
-        </w:rPr>
-        <w:t xml:space="preserve"> es la de </w:t>
-      </w:r>
-      <w:r>
-        <w:rPr>
-          <w:b w:val="1"/>
-          <w:bCs w:val="1"/>
-          <w:sz w:val="24"/>
-          <w:szCs w:val="24"/>
-          <w:lang w:val="en-US"/>
-        </w:rPr>
-        <w:t>Proyecto de Grado</w:t>
-      </w:r>
-      <w:r>
-        <w:rPr>
-          <w:sz w:val="24"/>
-          <w:szCs w:val="24"/>
-          <w:lang w:val="en-US"/>
-        </w:rPr>
-        <w:t xml:space="preserve">, el </w:t>
-      </w:r>
-      <w:r>
-        <w:rPr>
-          <w:sz w:val="24"/>
-          <w:szCs w:val="24"/>
-          <w:lang w:val="en-US"/>
-        </w:rPr>
-        <w:t>cual</w:t>
-      </w:r>
-      <w:r>
-        <w:rPr>
-          <w:sz w:val="24"/>
-          <w:szCs w:val="24"/>
-          <w:lang w:val="en-US"/>
-        </w:rPr>
-        <w:t xml:space="preserve"> se </w:t>
-      </w:r>
-      <w:r>
-        <w:rPr>
-          <w:sz w:val="24"/>
-          <w:szCs w:val="24"/>
-          <w:lang w:val="en-US"/>
-        </w:rPr>
-        <w:t>desarrollará</w:t>
-      </w:r>
-      <w:r>
-        <w:rPr>
-          <w:sz w:val="24"/>
-          <w:szCs w:val="24"/>
-          <w:lang w:val="en-US"/>
-        </w:rPr>
-        <w:t xml:space="preserve"> bajo la </w:t>
-      </w:r>
-      <w:r>
-        <w:rPr>
-          <w:sz w:val="24"/>
-          <w:szCs w:val="24"/>
-          <w:lang w:val="en-US"/>
-        </w:rPr>
-        <w:t>dirección</w:t>
-      </w:r>
-      <w:r>
-        <w:rPr>
-          <w:sz w:val="24"/>
-          <w:szCs w:val="24"/>
-          <w:lang w:val="en-US"/>
-        </w:rPr>
-        <w:t xml:space="preserve"> del </w:t>
-      </w:r>
-      <w:r>
-        <w:rPr>
-          <w:sz w:val="24"/>
-          <w:szCs w:val="24"/>
-          <w:lang w:val="en-US"/>
-        </w:rPr>
-        <w:t>ingeniero</w:t>
-      </w:r>
-      <w:r>
-        <w:rPr>
-          <w:sz w:val="24"/>
-          <w:szCs w:val="24"/>
-          <w:lang w:val="en-US"/>
-        </w:rPr>
-        <w:t xml:space="preserve"> </w:t>
-      </w:r>
-      <w:r>
-        <w:rPr>
-          <w:b w:val="1"/>
-          <w:bCs w:val="1"/>
-          <w:sz w:val="24"/>
-          <w:szCs w:val="24"/>
-          <w:lang w:val="en-US"/>
-        </w:rPr>
-        <w:t>Luis Ángel Vargas</w:t>
-      </w:r>
-      <w:r>
-        <w:rPr>
-          <w:b w:val="1"/>
-          <w:bCs w:val="1"/>
-          <w:sz w:val="24"/>
-          <w:szCs w:val="24"/>
-          <w:lang w:val="en-US"/>
-        </w:rPr>
-        <w:t xml:space="preserve"> Narvae</w:t>
-      </w:r>
-      <w:r>
-        <w:rPr>
-          <w:b w:val="1"/>
-          <w:bCs w:val="1"/>
-          <w:sz w:val="24"/>
-          <w:szCs w:val="24"/>
-          <w:lang w:val="en-US"/>
-        </w:rPr>
-        <w:t>z</w:t>
-      </w:r>
-      <w:r>
-        <w:rPr>
-          <w:sz w:val="24"/>
-          <w:szCs w:val="24"/>
-          <w:lang w:val="en-US"/>
-        </w:rPr>
-        <w:t xml:space="preserve">, </w:t>
-      </w:r>
-      <w:r>
-        <w:rPr>
-          <w:sz w:val="24"/>
-          <w:szCs w:val="24"/>
-          <w:lang w:val="en-US"/>
-        </w:rPr>
-        <w:t>quien</w:t>
-      </w:r>
-      <w:r>
-        <w:rPr>
-          <w:sz w:val="24"/>
-          <w:szCs w:val="24"/>
-          <w:lang w:val="en-US"/>
-        </w:rPr>
-        <w:t xml:space="preserve"> </w:t>
-      </w:r>
-      <w:r>
-        <w:rPr>
-          <w:sz w:val="24"/>
-          <w:szCs w:val="24"/>
-          <w:lang w:val="en-US"/>
-        </w:rPr>
-        <w:t>orientará</w:t>
-      </w:r>
-      <w:r>
-        <w:rPr>
-          <w:sz w:val="24"/>
-          <w:szCs w:val="24"/>
-          <w:lang w:val="en-US"/>
-        </w:rPr>
-        <w:t xml:space="preserve"> y </w:t>
-      </w:r>
-      <w:r>
-        <w:rPr>
-          <w:sz w:val="24"/>
-          <w:szCs w:val="24"/>
-          <w:lang w:val="en-US"/>
-        </w:rPr>
-        <w:t>acompañará</w:t>
-      </w:r>
-      <w:r>
-        <w:rPr>
-          <w:sz w:val="24"/>
-          <w:szCs w:val="24"/>
-          <w:lang w:val="en-US"/>
-        </w:rPr>
-        <w:t xml:space="preserve"> el </w:t>
-      </w:r>
-      <w:r>
-        <w:rPr>
-          <w:sz w:val="24"/>
-          <w:szCs w:val="24"/>
-          <w:lang w:val="en-US"/>
-        </w:rPr>
-        <w:t>proceso</w:t>
-      </w:r>
-      <w:r>
-        <w:rPr>
-          <w:sz w:val="24"/>
-          <w:szCs w:val="24"/>
-          <w:lang w:val="en-US"/>
-        </w:rPr>
-        <w:t xml:space="preserve"> de </w:t>
-      </w:r>
-      <w:r>
-        <w:rPr>
-          <w:sz w:val="24"/>
-          <w:szCs w:val="24"/>
-          <w:lang w:val="en-US"/>
-        </w:rPr>
-        <w:t>formulación</w:t>
-      </w:r>
-      <w:r>
-        <w:rPr>
-          <w:sz w:val="24"/>
-          <w:szCs w:val="24"/>
-          <w:lang w:val="en-US"/>
-        </w:rPr>
-        <w:t xml:space="preserve"> y </w:t>
-      </w:r>
-      <w:r>
-        <w:rPr>
-          <w:sz w:val="24"/>
-          <w:szCs w:val="24"/>
-          <w:lang w:val="en-US"/>
-        </w:rPr>
-        <w:t>ejecución</w:t>
-      </w:r>
-      <w:r>
-        <w:rPr>
-          <w:sz w:val="24"/>
-          <w:szCs w:val="24"/>
-          <w:lang w:val="en-US"/>
-        </w:rPr>
-        <w:t xml:space="preserve"> del </w:t>
-      </w:r>
-      <w:r>
-        <w:rPr>
-          <w:sz w:val="24"/>
-          <w:szCs w:val="24"/>
-          <w:lang w:val="en-US"/>
-        </w:rPr>
-        <w:t>mismo</w:t>
-      </w:r>
-      <w:r>
-        <w:rPr>
-          <w:sz w:val="24"/>
-          <w:szCs w:val="24"/>
-          <w:lang w:val="en-US"/>
-        </w:rPr>
-        <w:t>.</w:t>
+        <w:t xml:space="preserve">La modalidad escogida para optar al título es la de Proyecto de Grado, titulado «MSPI: sistema de gestión de seguridad y privacidad de la información basado en ISO/IEC 27001, implementado mediante una plataforma de microservicios y microfrontends», el cual se desarrollará bajo la dirección del ingeniero Luis Ángel Vargas Narvaez, quien orientará y acompañará el proceso de formulación y ejecución del mismo.</w:t>
       </w:r>
     </w:p>
     <w:p xmlns:wp14="http://schemas.microsoft.com/office/word/2010/wordml" wp14:textId="1C0D5F2E">
@@ -605,6 +209,7 @@
     </w:p>
     <w:p xmlns:wp14="http://schemas.microsoft.com/office/word/2010/wordml" wp14:textId="77777777">
       <w:pPr>
+        <w:keepNext/>
         <w:spacing w:after="600"/>
       </w:pPr>
       <w:r>
@@ -618,6 +223,7 @@
     </w:p>
     <w:p xmlns:wp14="http://schemas.microsoft.com/office/word/2010/wordml" wp14:textId="77777777">
       <w:pPr>
+        <w:keepNext/>
         <w:spacing w:after="0"/>
       </w:pPr>
       <w:r>
@@ -630,6 +236,7 @@
     </w:p>
     <w:p xmlns:wp14="http://schemas.microsoft.com/office/word/2010/wordml" wp14:textId="6826F561">
       <w:pPr>
+        <w:keepNext/>
         <w:spacing w:after="0"/>
       </w:pPr>
       <w:r>
@@ -645,6 +252,7 @@
     </w:p>
     <w:p xmlns:wp14="http://schemas.microsoft.com/office/word/2010/wordml" wp14:textId="641263D5">
       <w:pPr>
+        <w:keepNext/>
         <w:spacing w:after="0"/>
         <w:rPr>
           <w:sz w:val="24"/>
@@ -671,6 +279,7 @@
     </w:p>
     <w:p xmlns:wp14="http://schemas.microsoft.com/office/word/2010/wordml" wp14:textId="40A29E3B">
       <w:pPr>
+        <w:keepNext/>
         <w:spacing w:after="600"/>
       </w:pPr>
       <w:r>
@@ -679,27 +288,12 @@
           <w:szCs w:val="24"/>
           <w:lang w:val="en-US"/>
         </w:rPr>
-        <w:t>Programa</w:t>
-      </w:r>
-      <w:r>
-        <w:rPr>
-          <w:sz w:val="24"/>
-          <w:szCs w:val="24"/>
-          <w:lang w:val="en-US"/>
-        </w:rPr>
-        <w:t xml:space="preserve">: </w:t>
-      </w:r>
-      <w:r>
-        <w:rPr>
-          <w:sz w:val="24"/>
-          <w:szCs w:val="24"/>
-          <w:lang w:val="en-US"/>
-        </w:rPr>
-        <w:t>Ingenieria de sistemas</w:t>
+        <w:t xml:space="preserve">Programa: Ingeniería de Sistemas</w:t>
       </w:r>
     </w:p>
     <w:p>
       <w:pPr>
+        <w:keepNext/>
         <w:spacing w:after="600"/>
         <w:rPr>
           <w:sz w:val="24"/>
@@ -710,6 +304,7 @@
     </w:p>
     <w:p>
       <w:pPr>
+        <w:keepNext/>
         <w:spacing w:after="600"/>
         <w:rPr>
           <w:sz w:val="24"/>
@@ -720,6 +315,7 @@
     </w:p>
     <w:p xmlns:wp14="http://schemas.microsoft.com/office/word/2010/wordml" wp14:textId="77777777">
       <w:pPr>
+        <w:keepNext/>
         <w:spacing w:after="0"/>
       </w:pPr>
       <w:r>
@@ -732,6 +328,7 @@
     </w:p>
     <w:p xmlns:wp14="http://schemas.microsoft.com/office/word/2010/wordml" wp14:textId="15F7C66D">
       <w:pPr>
+        <w:keepNext/>
         <w:spacing w:after="0"/>
         <w:rPr>
           <w:b w:val="1"/>
@@ -754,6 +351,7 @@
     </w:p>
     <w:p xmlns:wp14="http://schemas.microsoft.com/office/word/2010/wordml" wp14:textId="01A607A2">
       <w:pPr>
+        <w:keepNext/>
         <w:spacing w:after="0"/>
       </w:pPr>
       <w:r>
@@ -783,23 +381,7 @@
           <w:szCs w:val="24"/>
           <w:lang w:val="en-US"/>
         </w:rPr>
-        <w:t>Programa</w:t>
-      </w:r>
-      <w:r>
-        <w:rPr>
-          <w:sz w:val="24"/>
-          <w:szCs w:val="24"/>
-          <w:lang w:val="en-US"/>
-        </w:rPr>
-        <w:t xml:space="preserve">: </w:t>
-      </w:r>
-      <w:r>
-        <w:rPr>
-          <w:sz w:val="24"/>
-          <w:szCs w:val="24"/>
-          <w:lang w:val="en-US"/>
-        </w:rPr>
-        <w:t>Ingenieria de sistemas</w:t>
+        <w:t xml:space="preserve">Programa: Ingeniería de Sistemas</w:t>
       </w:r>
     </w:p>
     <w:sectPr>

</xml_diff>